<commit_message>
Fix Zenodo DOI metadata for v4.0.1
Replace the Final V4 PDF and DOCX with DOI-corrected files and update the README citation metadata. No research data, methods, figures, results, or conclusions were changed.
</commit_message>
<xml_diff>
--- a/report/CXMT_IPO_Research_Note_Final_V4_2026-08-08.docx
+++ b/report/CXMT_IPO_Research_Note_Final_V4_2026-08-08.docx
@@ -6869,7 +6869,7 @@
           <w:color w:val="000000"/>
           <w:sz w:val="17"/>
         </w:rPr>
-        <w:t xml:space="preserve">Replication package: </w:t>
+        <w:t xml:space="preserve">Archived replication package: </w:t>
       </w:r>
       <w:r>
         <w:rPr>
@@ -6879,7 +6879,7 @@
           <w:color w:val="000000"/>
           <w:sz w:val="17"/>
         </w:rPr>
-        <w:t>Zenodo archival and DOI assignment will follow publication of the final frozen repository version.</w:t>
+        <w:t>https://doi.org/10.5281/zenodo.21847934</w:t>
       </w:r>
     </w:p>
     <w:p>

</xml_diff>